<commit_message>
First Asset Licence Added
</commit_message>
<xml_diff>
--- a/Asset Integration.docx
+++ b/Asset Integration.docx
@@ -109,6 +109,25 @@
       <w:r>
         <w:rPr>
           <w:rFonts w:hint="default"/>
+          <w:b/>
+          <w:bCs/>
+          <w:lang w:val="de-DE"/>
+        </w:rPr>
+        <w:t>Verwendetes Asset:</w:t>
+      </w:r>
+      <w:bookmarkStart w:id="0" w:name="_GoBack"/>
+      <w:bookmarkEnd w:id="0"/>
+    </w:p>
+    <w:p>
+      <w:pPr>
+        <w:rPr>
+          <w:rFonts w:hint="default"/>
+          <w:lang w:val="de-DE"/>
+        </w:rPr>
+      </w:pPr>
+      <w:r>
+        <w:rPr>
+          <w:rFonts w:hint="default"/>
           <w:lang w:val="de-DE"/>
         </w:rPr>
         <w:fldChar w:fldCharType="begin"/>
@@ -141,21 +160,6 @@
           <w:lang w:val="de-DE"/>
         </w:rPr>
         <w:fldChar w:fldCharType="end"/>
-      </w:r>
-    </w:p>
-    <w:p>
-      <w:pPr>
-        <w:rPr>
-          <w:rFonts w:hint="default"/>
-          <w:lang w:val="de-DE"/>
-        </w:rPr>
-      </w:pPr>
-      <w:r>
-        <w:rPr>
-          <w:rFonts w:hint="default"/>
-          <w:lang w:val="de-DE"/>
-        </w:rPr>
-        <w:t xml:space="preserve">Asset was verwendet wird. </w:t>
       </w:r>
     </w:p>
     <w:p>
@@ -389,6 +393,21 @@
     </w:p>
     <w:p>
       <w:pPr>
+        <w:rPr>
+          <w:rFonts w:hint="default"/>
+          <w:lang w:val="de-DE"/>
+        </w:rPr>
+      </w:pPr>
+      <w:r>
+        <w:rPr>
+          <w:rFonts w:hint="default"/>
+          <w:lang w:val="de-DE"/>
+        </w:rPr>
+        <w:t>Es wird für die Lizenz keine Attribution benötigt. Das Werk wurde der Öffentlichkeit Zugeschrieben und damit alle Rechte die mit dem Urheberrecht bzw mit den Schutzrechten zutun haben abgegeben. In bestimmten fällen kann es jedoch sinnvoll sein eine Lizenz beizufügen, obwohl dies nur in sehr seltenen Fällen einen weiteren Schutz bieten kann.</w:t>
+      </w:r>
+    </w:p>
+    <w:p>
+      <w:pPr>
         <w:pStyle w:val="4"/>
         <w:bidi w:val="0"/>
         <w:rPr>
@@ -414,6 +433,52 @@
     </w:p>
     <w:p>
       <w:pPr>
+        <w:rPr>
+          <w:rFonts w:hint="default"/>
+          <w:lang w:val="de-DE"/>
+        </w:rPr>
+      </w:pPr>
+      <w:r>
+        <w:rPr>
+          <w:rFonts w:hint="default"/>
+          <w:lang w:val="de-DE"/>
+        </w:rPr>
+        <w:t>Man kann das Werk sowohl als Commerciale als auch als Private Person ohne Einschränkungen verwenden und dieses auch beliebig verändern, verwenden, modifizeren oder verbreiten ohne dem Ersteller Bescheid zu geben oder ihn in irgendeiner weise in dem Werk anzugeben.</w:t>
+      </w:r>
+    </w:p>
+    <w:p>
+      <w:pPr>
+        <w:rPr>
+          <w:rFonts w:hint="default"/>
+          <w:lang w:val="de-DE"/>
+        </w:rPr>
+      </w:pPr>
+    </w:p>
+    <w:p>
+      <w:pPr>
+        <w:rPr>
+          <w:rFonts w:hint="default"/>
+          <w:lang w:val="de-DE"/>
+        </w:rPr>
+      </w:pPr>
+      <w:r>
+        <w:rPr>
+          <w:rFonts w:hint="default"/>
+          <w:lang w:val="de-DE"/>
+        </w:rPr>
+        <w:t>Man kann sie auch in abgeleiteten Projekten verwenden, welche möglicherweise für Kommerzielle Werke genutzt werden. (Mehr Informationen weiter unten [Copyleft, Kompatibilität])</w:t>
+      </w:r>
+    </w:p>
+    <w:p>
+      <w:pPr>
+        <w:rPr>
+          <w:rFonts w:hint="default"/>
+          <w:lang w:val="de-DE"/>
+        </w:rPr>
+      </w:pPr>
+    </w:p>
+    <w:p>
+      <w:pPr>
         <w:pStyle w:val="4"/>
         <w:bidi w:val="0"/>
         <w:rPr>
@@ -439,6 +504,67 @@
     </w:p>
     <w:p>
       <w:pPr>
+        <w:rPr>
+          <w:rFonts w:hint="default"/>
+          <w:lang w:val="de-DE"/>
+        </w:rPr>
+      </w:pPr>
+      <w:r>
+        <w:rPr>
+          <w:rFonts w:hint="default"/>
+          <w:lang w:val="de-DE"/>
+        </w:rPr>
+        <w:t>Es wird keinerlei Gewährleistung in Bezug auf die Verfügung der gestellten Werke gegeben.</w:t>
+      </w:r>
+    </w:p>
+    <w:p>
+      <w:pPr>
+        <w:rPr>
+          <w:rFonts w:hint="default"/>
+          <w:lang w:val="de-DE"/>
+        </w:rPr>
+      </w:pPr>
+    </w:p>
+    <w:p>
+      <w:pPr>
+        <w:rPr>
+          <w:rFonts w:hint="default"/>
+          <w:lang w:val="de-DE"/>
+        </w:rPr>
+      </w:pPr>
+      <w:r>
+        <w:rPr>
+          <w:rFonts w:hint="default"/>
+          <w:lang w:val="de-DE"/>
+        </w:rPr>
+        <w:t>Im Abschnitt "Limitations and Disclaimers" (Einschränkungen und Haftungsausschlüsse) der CC0-Lizenz wird ausdrücklich festgelegt, dass der Lizenzgeber keine Zusicherungen oder Garantien jeglicher Art in Bezug auf das Werk abgibt.</w:t>
+      </w:r>
+    </w:p>
+    <w:p>
+      <w:pPr>
+        <w:rPr>
+          <w:rFonts w:hint="default"/>
+          <w:lang w:val="de-DE"/>
+        </w:rPr>
+      </w:pPr>
+    </w:p>
+    <w:p>
+      <w:pPr>
+        <w:rPr>
+          <w:rFonts w:hint="default"/>
+          <w:lang w:val="de-DE"/>
+        </w:rPr>
+      </w:pPr>
+      <w:r>
+        <w:rPr>
+          <w:rFonts w:hint="default"/>
+          <w:lang w:val="de-DE"/>
+        </w:rPr>
+        <w:t>Das bedeutet, dass der Lizenzgeber des Werks keine Zusicherungen oder Garantien bezüglich des Werks abgibt, sei es ausdrücklich, stillschweigend, gesetzlich oder anderweitig. Es werden keine Garantien für Titel, Marktgängigkeit, Eignung für einen bestimmten Zweck, Nichtverletzung, das Fehlen versteckter Mängel, Genauigkeit oder das Vorhandensein oder Fehlen von Fehlern gegeben, egal ob diese entdeckbar sind oder nicht. Dies geschieht im größtmöglichen Umfang, der nach anwendbarem Recht zulässig ist.</w:t>
+      </w:r>
+    </w:p>
+    <w:p>
+      <w:pPr>
         <w:pStyle w:val="4"/>
         <w:bidi w:val="0"/>
         <w:rPr>
@@ -456,6 +582,98 @@
     </w:p>
     <w:p>
       <w:pPr>
+        <w:rPr>
+          <w:rFonts w:hint="default"/>
+          <w:lang w:val="de-DE"/>
+        </w:rPr>
+      </w:pPr>
+    </w:p>
+    <w:p>
+      <w:pPr>
+        <w:rPr>
+          <w:rFonts w:hint="default"/>
+          <w:lang w:val="de-DE"/>
+        </w:rPr>
+      </w:pPr>
+      <w:r>
+        <w:rPr>
+          <w:rFonts w:hint="default"/>
+          <w:lang w:val="de-DE"/>
+        </w:rPr>
+        <w:t>Copyleft wird verwendet für Lizenzen bei der die Freiheit gegeben ist, das Werk zu verwenden, zu modifizieren und weiterzugeben, solange das abgeleitete Werk unter den selben Bedingungen veröffentlicht wird.</w:t>
+      </w:r>
+    </w:p>
+    <w:p>
+      <w:pPr>
+        <w:rPr>
+          <w:rFonts w:hint="default"/>
+          <w:lang w:val="de-DE"/>
+        </w:rPr>
+      </w:pPr>
+    </w:p>
+    <w:p>
+      <w:pPr>
+        <w:rPr>
+          <w:rFonts w:hint="default"/>
+          <w:lang w:val="de-DE"/>
+        </w:rPr>
+      </w:pPr>
+      <w:r>
+        <w:rPr>
+          <w:rFonts w:hint="default"/>
+          <w:lang w:val="de-DE"/>
+        </w:rPr>
+        <w:t>Die CC0 1.0 Universal Lizenz (CC0) ist keine "Copyleft"-Lizenz. Im Gegensatz zu "Copyleft"-Lizenzen wie der GNU General Public License (GPL) oder der Creative Commons Attribution-ShareAlike (CC BY-SA) Lizenz, die die Veröffentlichung von abgeleiteten Werken unter denselben Bedingungen erfordern, erlaubt die CC0-Lizenz die maximale Freiheit und Flexibilität für die Nutzung, Modifikation und Verbreitung von Werken.</w:t>
+      </w:r>
+    </w:p>
+    <w:p>
+      <w:pPr>
+        <w:rPr>
+          <w:rFonts w:hint="default"/>
+          <w:lang w:val="de-DE"/>
+        </w:rPr>
+      </w:pPr>
+    </w:p>
+    <w:p>
+      <w:pPr>
+        <w:rPr>
+          <w:rFonts w:hint="default"/>
+          <w:lang w:val="de-DE"/>
+        </w:rPr>
+      </w:pPr>
+      <w:r>
+        <w:rPr>
+          <w:rFonts w:hint="default"/>
+          <w:lang w:val="de-DE"/>
+        </w:rPr>
+        <w:t>Das heißt wenn ein Werk unter der CC0 1.0 Universal Lizenz steht, darf man die abgeleiteten Werke in jede beliebige Lizenz umwandeln, einschließlich proprietärer Lizenzen, ohne die Verpflichtung, abgeleitete Werke unter denselben Bedingungen freizugeben.</w:t>
+      </w:r>
+    </w:p>
+    <w:p>
+      <w:pPr>
+        <w:rPr>
+          <w:rFonts w:hint="default"/>
+          <w:lang w:val="de-DE"/>
+        </w:rPr>
+      </w:pPr>
+    </w:p>
+    <w:p>
+      <w:pPr>
+        <w:rPr>
+          <w:rFonts w:hint="default"/>
+          <w:lang w:val="de-DE"/>
+        </w:rPr>
+      </w:pPr>
+      <w:r>
+        <w:rPr>
+          <w:rFonts w:hint="default"/>
+          <w:lang w:val="de-DE"/>
+        </w:rPr>
+        <w:t>Andere Nutzer haben somit die Freiheit, das Werk ohne Einschränkung zu verwenden, ohne Rücksicht darauf, wie sie abgeleitete Werke lizenzieren.</w:t>
+      </w:r>
+    </w:p>
+    <w:p>
+      <w:pPr>
         <w:pStyle w:val="4"/>
         <w:bidi w:val="0"/>
         <w:rPr>
@@ -481,6 +699,82 @@
     </w:p>
     <w:p>
       <w:pPr>
+        <w:rPr>
+          <w:rFonts w:hint="default"/>
+          <w:lang w:val="de-DE"/>
+        </w:rPr>
+      </w:pPr>
+      <w:r>
+        <w:rPr>
+          <w:rFonts w:hint="default"/>
+          <w:lang w:val="de-DE"/>
+        </w:rPr>
+        <w:t>Die Lizenz wurde entworfen, um so weit wie möglich mit anderen Lizenzen kompatibel zu sein.</w:t>
+      </w:r>
+    </w:p>
+    <w:p>
+      <w:pPr>
+        <w:rPr>
+          <w:rFonts w:hint="default"/>
+          <w:lang w:val="de-DE"/>
+        </w:rPr>
+      </w:pPr>
+      <w:r>
+        <w:rPr>
+          <w:rFonts w:hint="default"/>
+          <w:lang w:val="de-DE"/>
+        </w:rPr>
+        <w:t>Das heißt das ein Werk unter CC0 Lizenz in der Regel mit anderen Werken kombiniert werden können, die unter verschiedenen Lizenzen stehen, ohne das es zu Konflikten oder Einschränkungen kommt.</w:t>
+      </w:r>
+    </w:p>
+    <w:p>
+      <w:pPr>
+        <w:rPr>
+          <w:rFonts w:hint="default"/>
+          <w:lang w:val="de-DE"/>
+        </w:rPr>
+      </w:pPr>
+      <w:r>
+        <w:rPr>
+          <w:rFonts w:hint="default"/>
+          <w:lang w:val="de-DE"/>
+        </w:rPr>
+        <w:t>Sie wurde speziell für diesen Zweck entwickelt um eine flexible und möglichst breite Nutzung von Werken zu ermöglichen.</w:t>
+      </w:r>
+    </w:p>
+    <w:p>
+      <w:pPr>
+        <w:rPr>
+          <w:rFonts w:hint="default"/>
+          <w:lang w:val="de-DE"/>
+        </w:rPr>
+      </w:pPr>
+    </w:p>
+    <w:p>
+      <w:pPr>
+        <w:rPr>
+          <w:rFonts w:hint="default"/>
+          <w:lang w:val="de-DE"/>
+        </w:rPr>
+      </w:pPr>
+      <w:r>
+        <w:rPr>
+          <w:rFonts w:hint="default"/>
+          <w:lang w:val="de-DE"/>
+        </w:rPr>
+        <w:t>Bei der genauen Kompatibilität zwischen verschiedenen Lizenzen kann jedoch von Fall zu Fall unterschiedlich sein.</w:t>
+      </w:r>
+    </w:p>
+    <w:p>
+      <w:pPr>
+        <w:rPr>
+          <w:rFonts w:hint="default"/>
+          <w:lang w:val="de-DE"/>
+        </w:rPr>
+      </w:pPr>
+    </w:p>
+    <w:p>
+      <w:pPr>
         <w:pStyle w:val="4"/>
         <w:bidi w:val="0"/>
         <w:rPr>
@@ -498,13 +792,41 @@
     </w:p>
     <w:p>
       <w:pPr>
-        <w:pStyle w:val="4"/>
-        <w:bidi w:val="0"/>
-        <w:rPr>
-          <w:rFonts w:hint="default"/>
-          <w:lang w:val="de-DE"/>
-        </w:rPr>
-      </w:pPr>
+        <w:rPr>
+          <w:rFonts w:hint="default"/>
+          <w:lang w:val="de-DE"/>
+        </w:rPr>
+      </w:pPr>
+    </w:p>
+    <w:p>
+      <w:pPr>
+        <w:rPr>
+          <w:rFonts w:hint="default"/>
+          <w:lang w:val="de-DE"/>
+        </w:rPr>
+      </w:pPr>
+      <w:r>
+        <w:rPr>
+          <w:rFonts w:hint="default"/>
+          <w:lang w:val="de-DE"/>
+        </w:rPr>
+        <w:t>Die Lizenz hat im Bezug auf mein Projekt einen eher kleinen bis gar keinen Einfluss, da ich erstens noch nicht Publik gehen werden mit dem Projekt, sowie es keine Einschränkungen im Bezug auf Angaben und Pflichten darstellt.</w:t>
+      </w:r>
+    </w:p>
+    <w:p>
+      <w:pPr>
+        <w:rPr>
+          <w:rFonts w:hint="default"/>
+          <w:lang w:val="de-DE"/>
+        </w:rPr>
+      </w:pPr>
+      <w:r>
+        <w:rPr>
+          <w:rFonts w:hint="default"/>
+          <w:lang w:val="de-DE"/>
+        </w:rPr>
+        <w:t>Somit muss ich den Schöpfer nicht angeben sowie keine extra Schritte einleiten um dieses Asset in meinem Werk zu verwenden.</w:t>
+      </w:r>
     </w:p>
     <w:p>
       <w:pPr>
@@ -594,16 +916,7 @@
           <w:rFonts w:hint="default"/>
           <w:lang w:val="de-DE"/>
         </w:rPr>
-        <w:t>Quellenangaben</w:t>
-      </w:r>
-      <w:bookmarkStart w:id="0" w:name="_GoBack"/>
-      <w:bookmarkEnd w:id="0"/>
-      <w:r>
-        <w:rPr>
-          <w:rFonts w:hint="default"/>
-          <w:lang w:val="de-DE"/>
-        </w:rPr>
-        <w:t>:</w:t>
+        <w:t>Quellenangaben:</w:t>
       </w:r>
     </w:p>
     <w:p>

</xml_diff>